<commit_message>
add SDD to docs
</commit_message>
<xml_diff>
--- a/doc/Iter1/CS673_SDD_team2.docx
+++ b/doc/Iter1/CS673_SDD_team2.docx
@@ -49,12 +49,12 @@
             <wp:extent cx="1133475" cy="847725"/>
             <wp:effectExtent b="0" l="0" r="0" t="0"/>
             <wp:wrapSquare wrapText="bothSides" distB="19050" distT="19050" distL="19050" distR="19050"/>
-            <wp:docPr id="2" name="image1.png"/>
+            <wp:docPr id="4" name="image5.png"/>
             <a:graphic>
               <a:graphicData uri="http://schemas.openxmlformats.org/drawingml/2006/picture">
                 <pic:pic>
                   <pic:nvPicPr>
-                    <pic:cNvPr id="0" name="image1.png"/>
+                    <pic:cNvPr id="0" name="image5.png"/>
                     <pic:cNvPicPr preferRelativeResize="0"/>
                   </pic:nvPicPr>
                   <pic:blipFill>
@@ -665,19 +665,8 @@
           </w:tcPr>
           <w:p>
             <w:pPr>
-              <w:keepNext w:val="0"/>
-              <w:keepLines w:val="0"/>
               <w:widowControl w:val="0"/>
-              <w:pBdr>
-                <w:top w:space="0" w:sz="0" w:val="nil"/>
-                <w:left w:space="0" w:sz="0" w:val="nil"/>
-                <w:bottom w:space="0" w:sz="0" w:val="nil"/>
-                <w:right w:space="0" w:sz="0" w:val="nil"/>
-                <w:between w:space="0" w:sz="0" w:val="nil"/>
-              </w:pBdr>
-              <w:shd w:fill="auto" w:val="clear"/>
-              <w:spacing w:after="0" w:before="0" w:line="240" w:lineRule="auto"/>
-              <w:ind w:left="0" w:firstLine="0"/>
+              <w:spacing w:line="240" w:lineRule="auto"/>
               <w:rPr>
                 <w:sz w:val="24"/>
                 <w:szCs w:val="24"/>
@@ -686,8 +675,12 @@
             </w:pPr>
             <w:r>
               <w:rPr>
-                <w:rtl w:val="0"/>
-              </w:rPr>
+                <w:sz w:val="24"/>
+                <w:szCs w:val="24"/>
+                <w:u w:val="single"/>
+                <w:rtl w:val="0"/>
+              </w:rPr>
+              <w:t xml:space="preserve">10/26/2026</w:t>
             </w:r>
           </w:p>
         </w:tc>
@@ -792,19 +785,8 @@
           </w:tcPr>
           <w:p>
             <w:pPr>
-              <w:keepNext w:val="0"/>
-              <w:keepLines w:val="0"/>
               <w:widowControl w:val="0"/>
-              <w:pBdr>
-                <w:top w:space="0" w:sz="0" w:val="nil"/>
-                <w:left w:space="0" w:sz="0" w:val="nil"/>
-                <w:bottom w:space="0" w:sz="0" w:val="nil"/>
-                <w:right w:space="0" w:sz="0" w:val="nil"/>
-                <w:between w:space="0" w:sz="0" w:val="nil"/>
-              </w:pBdr>
-              <w:shd w:fill="auto" w:val="clear"/>
-              <w:spacing w:after="0" w:before="0" w:line="240" w:lineRule="auto"/>
-              <w:ind w:left="0" w:firstLine="0"/>
+              <w:spacing w:line="240" w:lineRule="auto"/>
               <w:rPr>
                 <w:sz w:val="24"/>
                 <w:szCs w:val="24"/>
@@ -813,8 +795,12 @@
             </w:pPr>
             <w:r>
               <w:rPr>
-                <w:rtl w:val="0"/>
-              </w:rPr>
+                <w:sz w:val="24"/>
+                <w:szCs w:val="24"/>
+                <w:u w:val="single"/>
+                <w:rtl w:val="0"/>
+              </w:rPr>
+              <w:t xml:space="preserve">10/26/2026</w:t>
             </w:r>
           </w:p>
         </w:tc>
@@ -919,19 +905,8 @@
           </w:tcPr>
           <w:p>
             <w:pPr>
-              <w:keepNext w:val="0"/>
-              <w:keepLines w:val="0"/>
               <w:widowControl w:val="0"/>
-              <w:pBdr>
-                <w:top w:space="0" w:sz="0" w:val="nil"/>
-                <w:left w:space="0" w:sz="0" w:val="nil"/>
-                <w:bottom w:space="0" w:sz="0" w:val="nil"/>
-                <w:right w:space="0" w:sz="0" w:val="nil"/>
-                <w:between w:space="0" w:sz="0" w:val="nil"/>
-              </w:pBdr>
-              <w:shd w:fill="auto" w:val="clear"/>
-              <w:spacing w:after="0" w:before="0" w:line="240" w:lineRule="auto"/>
-              <w:ind w:left="0" w:firstLine="0"/>
+              <w:spacing w:line="240" w:lineRule="auto"/>
               <w:rPr>
                 <w:sz w:val="24"/>
                 <w:szCs w:val="24"/>
@@ -940,8 +915,12 @@
             </w:pPr>
             <w:r>
               <w:rPr>
-                <w:rtl w:val="0"/>
-              </w:rPr>
+                <w:sz w:val="24"/>
+                <w:szCs w:val="24"/>
+                <w:u w:val="single"/>
+                <w:rtl w:val="0"/>
+              </w:rPr>
+              <w:t xml:space="preserve">10/26/2026</w:t>
             </w:r>
           </w:p>
         </w:tc>
@@ -1046,19 +1025,8 @@
           </w:tcPr>
           <w:p>
             <w:pPr>
-              <w:keepNext w:val="0"/>
-              <w:keepLines w:val="0"/>
               <w:widowControl w:val="0"/>
-              <w:pBdr>
-                <w:top w:space="0" w:sz="0" w:val="nil"/>
-                <w:left w:space="0" w:sz="0" w:val="nil"/>
-                <w:bottom w:space="0" w:sz="0" w:val="nil"/>
-                <w:right w:space="0" w:sz="0" w:val="nil"/>
-                <w:between w:space="0" w:sz="0" w:val="nil"/>
-              </w:pBdr>
-              <w:shd w:fill="auto" w:val="clear"/>
-              <w:spacing w:after="0" w:before="0" w:line="240" w:lineRule="auto"/>
-              <w:ind w:left="0" w:firstLine="0"/>
+              <w:spacing w:line="240" w:lineRule="auto"/>
               <w:rPr>
                 <w:sz w:val="24"/>
                 <w:szCs w:val="24"/>
@@ -1067,8 +1035,12 @@
             </w:pPr>
             <w:r>
               <w:rPr>
-                <w:rtl w:val="0"/>
-              </w:rPr>
+                <w:sz w:val="24"/>
+                <w:szCs w:val="24"/>
+                <w:u w:val="single"/>
+                <w:rtl w:val="0"/>
+              </w:rPr>
+              <w:t xml:space="preserve">10/26/2026</w:t>
             </w:r>
           </w:p>
         </w:tc>
@@ -2347,7 +2319,7 @@
     </w:p>
     <w:sdt>
       <w:sdtPr>
-        <w:id w:val="555189208"/>
+        <w:id w:val="1484205555"/>
         <w:docPartObj>
           <w:docPartGallery w:val="Table of Contents"/>
           <w:docPartUnique w:val="1"/>
@@ -3253,6 +3225,76 @@
         <w:rPr/>
       </w:pPr>
       <w:r>
+        <w:rPr/>
+        <w:drawing>
+          <wp:inline distB="114300" distT="114300" distL="114300" distR="114300">
+            <wp:extent cx="5943600" cy="3429000"/>
+            <wp:effectExtent b="0" l="0" r="0" t="0"/>
+            <wp:docPr id="5" name="image3.png"/>
+            <a:graphic>
+              <a:graphicData uri="http://schemas.openxmlformats.org/drawingml/2006/picture">
+                <pic:pic>
+                  <pic:nvPicPr>
+                    <pic:cNvPr id="0" name="image3.png"/>
+                    <pic:cNvPicPr preferRelativeResize="0"/>
+                  </pic:nvPicPr>
+                  <pic:blipFill>
+                    <a:blip r:embed="rId8"/>
+                    <a:srcRect b="0" l="0" r="0" t="0"/>
+                    <a:stretch>
+                      <a:fillRect/>
+                    </a:stretch>
+                  </pic:blipFill>
+                  <pic:spPr>
+                    <a:xfrm>
+                      <a:off x="0" y="0"/>
+                      <a:ext cx="5943600" cy="3429000"/>
+                    </a:xfrm>
+                    <a:prstGeom prst="rect"/>
+                    <a:ln/>
+                  </pic:spPr>
+                </pic:pic>
+              </a:graphicData>
+            </a:graphic>
+          </wp:inline>
+        </w:drawing>
+      </w:r>
+      <w:r>
+        <w:rPr/>
+        <w:drawing>
+          <wp:inline distB="114300" distT="114300" distL="114300" distR="114300">
+            <wp:extent cx="5943600" cy="4292600"/>
+            <wp:effectExtent b="0" l="0" r="0" t="0"/>
+            <wp:docPr id="2" name="image1.png"/>
+            <a:graphic>
+              <a:graphicData uri="http://schemas.openxmlformats.org/drawingml/2006/picture">
+                <pic:pic>
+                  <pic:nvPicPr>
+                    <pic:cNvPr id="0" name="image1.png"/>
+                    <pic:cNvPicPr preferRelativeResize="0"/>
+                  </pic:nvPicPr>
+                  <pic:blipFill>
+                    <a:blip r:embed="rId9"/>
+                    <a:srcRect b="0" l="0" r="0" t="0"/>
+                    <a:stretch>
+                      <a:fillRect/>
+                    </a:stretch>
+                  </pic:blipFill>
+                  <pic:spPr>
+                    <a:xfrm>
+                      <a:off x="0" y="0"/>
+                      <a:ext cx="5943600" cy="4292600"/>
+                    </a:xfrm>
+                    <a:prstGeom prst="rect"/>
+                    <a:ln/>
+                  </pic:spPr>
+                </pic:pic>
+              </a:graphicData>
+            </a:graphic>
+          </wp:inline>
+        </w:drawing>
+      </w:r>
+      <w:r>
         <w:rPr>
           <w:rtl w:val="0"/>
         </w:rPr>
@@ -3399,6 +3441,41 @@
         <w:ind w:left="720" w:firstLine="0"/>
         <w:rPr/>
       </w:pPr>
+      <w:r>
+        <w:rPr/>
+        <w:drawing>
+          <wp:inline distB="114300" distT="114300" distL="114300" distR="114300">
+            <wp:extent cx="5943600" cy="4559300"/>
+            <wp:effectExtent b="0" l="0" r="0" t="0"/>
+            <wp:docPr id="3" name="image4.png"/>
+            <a:graphic>
+              <a:graphicData uri="http://schemas.openxmlformats.org/drawingml/2006/picture">
+                <pic:pic>
+                  <pic:nvPicPr>
+                    <pic:cNvPr id="0" name="image4.png"/>
+                    <pic:cNvPicPr preferRelativeResize="0"/>
+                  </pic:nvPicPr>
+                  <pic:blipFill>
+                    <a:blip r:embed="rId10"/>
+                    <a:srcRect b="0" l="0" r="0" t="0"/>
+                    <a:stretch>
+                      <a:fillRect/>
+                    </a:stretch>
+                  </pic:blipFill>
+                  <pic:spPr>
+                    <a:xfrm>
+                      <a:off x="0" y="0"/>
+                      <a:ext cx="5943600" cy="4559300"/>
+                    </a:xfrm>
+                    <a:prstGeom prst="rect"/>
+                    <a:ln/>
+                  </pic:spPr>
+                </pic:pic>
+              </a:graphicData>
+            </a:graphic>
+          </wp:inline>
+        </w:drawing>
+      </w:r>
       <w:r>
         <w:rPr>
           <w:rtl w:val="0"/>
@@ -3971,6 +4048,41 @@
         <w:jc w:val="left"/>
         <w:rPr/>
       </w:pPr>
+      <w:r>
+        <w:rPr/>
+        <w:drawing>
+          <wp:inline distB="114300" distT="114300" distL="114300" distR="114300">
+            <wp:extent cx="5943600" cy="5676900"/>
+            <wp:effectExtent b="0" l="0" r="0" t="0"/>
+            <wp:docPr id="6" name="image2.png"/>
+            <a:graphic>
+              <a:graphicData uri="http://schemas.openxmlformats.org/drawingml/2006/picture">
+                <pic:pic>
+                  <pic:nvPicPr>
+                    <pic:cNvPr id="0" name="image2.png"/>
+                    <pic:cNvPicPr preferRelativeResize="0"/>
+                  </pic:nvPicPr>
+                  <pic:blipFill>
+                    <a:blip r:embed="rId11"/>
+                    <a:srcRect b="0" l="0" r="0" t="0"/>
+                    <a:stretch>
+                      <a:fillRect/>
+                    </a:stretch>
+                  </pic:blipFill>
+                  <pic:spPr>
+                    <a:xfrm>
+                      <a:off x="0" y="0"/>
+                      <a:ext cx="5943600" cy="5676900"/>
+                    </a:xfrm>
+                    <a:prstGeom prst="rect"/>
+                    <a:ln/>
+                  </pic:spPr>
+                </pic:pic>
+              </a:graphicData>
+            </a:graphic>
+          </wp:inline>
+        </w:drawing>
+      </w:r>
       <w:r>
         <w:rPr>
           <w:rtl w:val="0"/>
@@ -4905,82 +5017,6 @@
         </w:rPr>
         <w:t xml:space="preserve">MBTA V3 API documentation:</w:t>
       </w:r>
-      <w:hyperlink r:id="rId8">
-        <w:r>
-          <w:rPr>
-            <w:rtl w:val="0"/>
-          </w:rPr>
-          <w:t xml:space="preserve"> </w:t>
-        </w:r>
-      </w:hyperlink>
-      <w:hyperlink r:id="rId9">
-        <w:r>
-          <w:rPr>
-            <w:color w:val="1155cc"/>
-            <w:u w:val="single"/>
-            <w:rtl w:val="0"/>
-          </w:rPr>
-          <w:t xml:space="preserve">https://api-v3.mbta.com/docs/swagger/index.html</w:t>
-        </w:r>
-      </w:hyperlink>
-      <w:r>
-        <w:rPr>
-          <w:rtl w:val="0"/>
-        </w:rPr>
-      </w:r>
-    </w:p>
-    <w:p>
-      <w:pPr>
-        <w:numPr>
-          <w:ilvl w:val="0"/>
-          <w:numId w:val="2"/>
-        </w:numPr>
-        <w:ind w:left="1440" w:hanging="360"/>
-      </w:pPr>
-      <w:r>
-        <w:rPr>
-          <w:rtl w:val="0"/>
-        </w:rPr>
-        <w:t xml:space="preserve">Next.js documentation:</w:t>
-      </w:r>
-      <w:hyperlink r:id="rId10">
-        <w:r>
-          <w:rPr>
-            <w:rtl w:val="0"/>
-          </w:rPr>
-          <w:t xml:space="preserve"> </w:t>
-        </w:r>
-      </w:hyperlink>
-      <w:hyperlink r:id="rId11">
-        <w:r>
-          <w:rPr>
-            <w:color w:val="1155cc"/>
-            <w:u w:val="single"/>
-            <w:rtl w:val="0"/>
-          </w:rPr>
-          <w:t xml:space="preserve">https://nextjs.org/docs</w:t>
-        </w:r>
-      </w:hyperlink>
-      <w:r>
-        <w:rPr>
-          <w:rtl w:val="0"/>
-        </w:rPr>
-      </w:r>
-    </w:p>
-    <w:p>
-      <w:pPr>
-        <w:numPr>
-          <w:ilvl w:val="0"/>
-          <w:numId w:val="2"/>
-        </w:numPr>
-        <w:ind w:left="1440" w:hanging="360"/>
-      </w:pPr>
-      <w:r>
-        <w:rPr>
-          <w:rtl w:val="0"/>
-        </w:rPr>
-        <w:t xml:space="preserve">React documentation:</w:t>
-      </w:r>
       <w:hyperlink r:id="rId12">
         <w:r>
           <w:rPr>
@@ -4996,7 +5032,7 @@
             <w:u w:val="single"/>
             <w:rtl w:val="0"/>
           </w:rPr>
-          <w:t xml:space="preserve">https://react.dev/learn</w:t>
+          <w:t xml:space="preserve">https://api-v3.mbta.com/docs/swagger/index.html</w:t>
         </w:r>
       </w:hyperlink>
       <w:r>
@@ -5017,6 +5053,82 @@
         <w:rPr>
           <w:rtl w:val="0"/>
         </w:rPr>
+        <w:t xml:space="preserve">Next.js documentation:</w:t>
+      </w:r>
+      <w:hyperlink r:id="rId14">
+        <w:r>
+          <w:rPr>
+            <w:rtl w:val="0"/>
+          </w:rPr>
+          <w:t xml:space="preserve"> </w:t>
+        </w:r>
+      </w:hyperlink>
+      <w:hyperlink r:id="rId15">
+        <w:r>
+          <w:rPr>
+            <w:color w:val="1155cc"/>
+            <w:u w:val="single"/>
+            <w:rtl w:val="0"/>
+          </w:rPr>
+          <w:t xml:space="preserve">https://nextjs.org/docs</w:t>
+        </w:r>
+      </w:hyperlink>
+      <w:r>
+        <w:rPr>
+          <w:rtl w:val="0"/>
+        </w:rPr>
+      </w:r>
+    </w:p>
+    <w:p>
+      <w:pPr>
+        <w:numPr>
+          <w:ilvl w:val="0"/>
+          <w:numId w:val="2"/>
+        </w:numPr>
+        <w:ind w:left="1440" w:hanging="360"/>
+      </w:pPr>
+      <w:r>
+        <w:rPr>
+          <w:rtl w:val="0"/>
+        </w:rPr>
+        <w:t xml:space="preserve">React documentation:</w:t>
+      </w:r>
+      <w:hyperlink r:id="rId16">
+        <w:r>
+          <w:rPr>
+            <w:rtl w:val="0"/>
+          </w:rPr>
+          <w:t xml:space="preserve"> </w:t>
+        </w:r>
+      </w:hyperlink>
+      <w:hyperlink r:id="rId17">
+        <w:r>
+          <w:rPr>
+            <w:color w:val="1155cc"/>
+            <w:u w:val="single"/>
+            <w:rtl w:val="0"/>
+          </w:rPr>
+          <w:t xml:space="preserve">https://react.dev/learn</w:t>
+        </w:r>
+      </w:hyperlink>
+      <w:r>
+        <w:rPr>
+          <w:rtl w:val="0"/>
+        </w:rPr>
+      </w:r>
+    </w:p>
+    <w:p>
+      <w:pPr>
+        <w:numPr>
+          <w:ilvl w:val="0"/>
+          <w:numId w:val="2"/>
+        </w:numPr>
+        <w:ind w:left="1440" w:hanging="360"/>
+      </w:pPr>
+      <w:r>
+        <w:rPr>
+          <w:rtl w:val="0"/>
+        </w:rPr>
         <w:t xml:space="preserve">The team’s project repository and approved requirements/design materials.</w:t>
       </w:r>
     </w:p>
@@ -5367,7 +5479,7 @@
       </w:r>
     </w:p>
     <w:sectPr>
-      <w:headerReference r:id="rId14" w:type="default"/>
+      <w:headerReference r:id="rId18" w:type="default"/>
       <w:pgSz w:h="15840" w:w="12240" w:orient="portrait"/>
       <w:pgMar w:bottom="1440" w:top="1440" w:left="1440" w:right="1440" w:header="0" w:footer="720"/>
       <w:pgNumType w:start="1"/>

</xml_diff>